<commit_message>
fix: update placeorder files and activity diagram
</commit_message>
<xml_diff>
--- a/RequirementAnalysis/UCSpec/word/Place_Order.docx
+++ b/RequirementAnalysis/UCSpec/word/Place_Order.docx
@@ -198,32 +198,6 @@
             <w:pPr>
               <w:pStyle w:val="ListParagraph"/>
               <w:numPr>
-                <w:ilvl w:val="1"/>
-                <w:numId w:val="5"/>
-              </w:numPr>
-              <w:spacing w:after="120"/>
-              <w:rPr>
-                <w:b/>
-                <w:bCs/>
-                <w:sz w:val="28"/>
-                <w:szCs w:val="28"/>
-              </w:rPr>
-            </w:pPr>
-            <w:r>
-              <w:rPr>
-                <w:b/>
-                <w:bCs/>
-                <w:sz w:val="28"/>
-                <w:szCs w:val="28"/>
-                <w:lang w:val="en-US"/>
-              </w:rPr>
-              <w:t>AIMS software</w:t>
-            </w:r>
-          </w:p>
-          <w:p>
-            <w:pPr>
-              <w:pStyle w:val="ListParagraph"/>
-              <w:numPr>
                 <w:ilvl w:val="0"/>
                 <w:numId w:val="5"/>
               </w:numPr>
@@ -393,7 +367,23 @@
                 <w:szCs w:val="24"/>
                 <w:lang w:val="en-US"/>
               </w:rPr>
-              <w:t>Customer enters and submit delivery information (see Table 1)</w:t>
+              <w:t xml:space="preserve">Customer enters and </w:t>
+            </w:r>
+            <w:proofErr w:type="gramStart"/>
+            <w:r>
+              <w:rPr>
+                <w:szCs w:val="24"/>
+                <w:lang w:val="en-US"/>
+              </w:rPr>
+              <w:t>submit</w:t>
+            </w:r>
+            <w:proofErr w:type="gramEnd"/>
+            <w:r>
+              <w:rPr>
+                <w:szCs w:val="24"/>
+                <w:lang w:val="en-US"/>
+              </w:rPr>
+              <w:t xml:space="preserve"> delivery information (see Table 1)</w:t>
             </w:r>
           </w:p>
           <w:p>
@@ -433,7 +423,37 @@
                 <w:szCs w:val="24"/>
                 <w:lang w:val="en-US"/>
               </w:rPr>
-              <w:t>AIMS software calculates shipping fee</w:t>
+              <w:t xml:space="preserve">AIMS software </w:t>
+            </w:r>
+            <w:proofErr w:type="gramStart"/>
+            <w:r>
+              <w:rPr>
+                <w:szCs w:val="24"/>
+                <w:lang w:val="en-US"/>
+              </w:rPr>
+              <w:t>calculates</w:t>
+            </w:r>
+            <w:r>
+              <w:rPr>
+                <w:szCs w:val="24"/>
+                <w:lang w:val="en-US"/>
+              </w:rPr>
+              <w:t>(</w:t>
+            </w:r>
+            <w:proofErr w:type="gramEnd"/>
+            <w:r>
+              <w:rPr>
+                <w:szCs w:val="24"/>
+                <w:lang w:val="en-US"/>
+              </w:rPr>
+              <w:t>or recalculates)</w:t>
+            </w:r>
+            <w:r>
+              <w:rPr>
+                <w:szCs w:val="24"/>
+                <w:lang w:val="en-US"/>
+              </w:rPr>
+              <w:t xml:space="preserve"> shipping fee</w:t>
             </w:r>
           </w:p>
           <w:p>
@@ -448,12 +468,37 @@
                 <w:szCs w:val="24"/>
               </w:rPr>
             </w:pPr>
+            <w:proofErr w:type="gramStart"/>
             <w:r>
               <w:rPr>
                 <w:szCs w:val="24"/>
                 <w:lang w:val="en-US"/>
               </w:rPr>
-              <w:t>AIMS software displays invoice screen (see Table 2)</w:t>
+              <w:t>Customer</w:t>
+            </w:r>
+            <w:proofErr w:type="gramEnd"/>
+            <w:r>
+              <w:rPr>
+                <w:szCs w:val="24"/>
+                <w:lang w:val="en-US"/>
+              </w:rPr>
+              <w:t xml:space="preserve"> </w:t>
+            </w:r>
+            <w:proofErr w:type="gramStart"/>
+            <w:r>
+              <w:rPr>
+                <w:szCs w:val="24"/>
+                <w:lang w:val="en-US"/>
+              </w:rPr>
+              <w:t>ask</w:t>
+            </w:r>
+            <w:proofErr w:type="gramEnd"/>
+            <w:r>
+              <w:rPr>
+                <w:szCs w:val="24"/>
+                <w:lang w:val="en-US"/>
+              </w:rPr>
+              <w:t xml:space="preserve"> to pay order</w:t>
             </w:r>
           </w:p>
           <w:p>
@@ -473,7 +518,14 @@
                 <w:szCs w:val="24"/>
                 <w:lang w:val="en-US"/>
               </w:rPr>
-              <w:t>Customer ask to pay order</w:t>
+              <w:t>AIMS software display and temporarily save invoice information</w:t>
+            </w:r>
+            <w:r>
+              <w:rPr>
+                <w:szCs w:val="24"/>
+                <w:lang w:val="en-US"/>
+              </w:rPr>
+              <w:t xml:space="preserve"> (see Table 2)</w:t>
             </w:r>
           </w:p>
           <w:p>
@@ -511,9 +563,15 @@
             <w:r>
               <w:rPr>
                 <w:szCs w:val="24"/>
+              </w:rPr>
+              <w:t>AIMS software wil</w:t>
+            </w:r>
+            <w:r>
+              <w:rPr>
+                <w:szCs w:val="24"/>
                 <w:lang w:val="en-US"/>
               </w:rPr>
-              <w:t>AIMS software update the invoice status</w:t>
+              <w:t>l display general information of the order and transaction information(see Table 3)</w:t>
             </w:r>
           </w:p>
           <w:p>
@@ -533,7 +591,23 @@
                 <w:szCs w:val="24"/>
                 <w:lang w:val="en-US"/>
               </w:rPr>
-              <w:t>AIMS software saves a new order with invoice</w:t>
+              <w:t xml:space="preserve">AIMS software </w:t>
+            </w:r>
+            <w:proofErr w:type="gramStart"/>
+            <w:r>
+              <w:rPr>
+                <w:szCs w:val="24"/>
+                <w:lang w:val="en-US"/>
+              </w:rPr>
+              <w:t>update</w:t>
+            </w:r>
+            <w:proofErr w:type="gramEnd"/>
+            <w:r>
+              <w:rPr>
+                <w:szCs w:val="24"/>
+                <w:lang w:val="en-US"/>
+              </w:rPr>
+              <w:t xml:space="preserve"> the invoice status</w:t>
             </w:r>
           </w:p>
           <w:p>
@@ -553,7 +627,23 @@
                 <w:szCs w:val="24"/>
                 <w:lang w:val="en-US"/>
               </w:rPr>
-              <w:t>AIMS software makes the cart empty</w:t>
+              <w:t xml:space="preserve">AIMS software </w:t>
+            </w:r>
+            <w:proofErr w:type="gramStart"/>
+            <w:r>
+              <w:rPr>
+                <w:szCs w:val="24"/>
+                <w:lang w:val="en-US"/>
+              </w:rPr>
+              <w:t>send</w:t>
+            </w:r>
+            <w:proofErr w:type="gramEnd"/>
+            <w:r>
+              <w:rPr>
+                <w:szCs w:val="24"/>
+                <w:lang w:val="en-US"/>
+              </w:rPr>
+              <w:t xml:space="preserve"> invoice and payment transaction information to the customer’s email</w:t>
             </w:r>
           </w:p>
           <w:p>
@@ -571,29 +661,15 @@
             <w:r>
               <w:rPr>
                 <w:szCs w:val="24"/>
-                <w:lang w:val="en-US"/>
-              </w:rPr>
-              <w:t>The AIMS software sends email about the successfull order notification and information to customer</w:t>
+              </w:rPr>
+              <w:t>AIMS software records the p</w:t>
             </w:r>
-          </w:p>
-          <w:p>
-            <w:pPr>
-              <w:pStyle w:val="ListParagraph"/>
-              <w:numPr>
-                <w:ilvl w:val="0"/>
-                <w:numId w:val="6"/>
-              </w:numPr>
-              <w:spacing w:after="120"/>
-              <w:rPr>
-                <w:szCs w:val="24"/>
-              </w:rPr>
-            </w:pPr>
             <w:r>
               <w:rPr>
                 <w:szCs w:val="24"/>
                 <w:lang w:val="en-US"/>
               </w:rPr>
-              <w:t xml:space="preserve">The AIMS software displays the successful order information and the transaction information (see Table 3) </w:t>
+              <w:t>ayment transaction and the successfully paid order</w:t>
             </w:r>
           </w:p>
           <w:p>
@@ -809,7 +885,7 @@
                       <w:sz w:val="20"/>
                       <w:lang w:val="en-US"/>
                     </w:rPr>
-                    <w:t>3</w:t>
+                    <w:t>2</w:t>
                   </w:r>
                 </w:p>
               </w:tc>
@@ -836,7 +912,14 @@
                       <w:sz w:val="20"/>
                       <w:lang w:val="en-US"/>
                     </w:rPr>
-                    <w:t xml:space="preserve"> the products are not available</w:t>
+                    <w:t xml:space="preserve"> </w:t>
+                  </w:r>
+                  <w:r>
+                    <w:rPr>
+                      <w:sz w:val="20"/>
+                      <w:lang w:val="en-US"/>
+                    </w:rPr>
+                    <w:t>the available stock is insufficient</w:t>
                   </w:r>
                 </w:p>
               </w:tc>
@@ -862,7 +945,14 @@
                       <w:sz w:val="20"/>
                       <w:lang w:val="en-US"/>
                     </w:rPr>
-                    <w:t>The AIMS software notifies that the products in the cart are not available and stay at the use case “View cart”</w:t>
+                    <w:t xml:space="preserve">The AIMS software notifies </w:t>
+                  </w:r>
+                  <w:r>
+                    <w:rPr>
+                      <w:sz w:val="20"/>
+                      <w:lang w:val="en-US"/>
+                    </w:rPr>
+                    <w:t>the customer to update the cart and displays the available quantity for each affected product</w:t>
                   </w:r>
                 </w:p>
               </w:tc>
@@ -1040,7 +1130,14 @@
                       <w:sz w:val="20"/>
                       <w:lang w:val="en-US"/>
                     </w:rPr>
-                    <w:t>At Step 8</w:t>
+                    <w:t xml:space="preserve">At Step </w:t>
+                  </w:r>
+                  <w:r>
+                    <w:rPr>
+                      <w:sz w:val="20"/>
+                      <w:lang w:val="en-US"/>
+                    </w:rPr>
+                    <w:t>9</w:t>
                   </w:r>
                 </w:p>
               </w:tc>
@@ -1536,7 +1633,23 @@
                       <w:sz w:val="20"/>
                       <w:lang w:val="en-US"/>
                     </w:rPr>
-                    <w:t>-May contains separator “.” or space or “-” in the middle of the phone number(one separator type)</w:t>
+                    <w:t xml:space="preserve">-May contains separator “.” or space or “-” in the middle of the phone </w:t>
+                  </w:r>
+                  <w:proofErr w:type="gramStart"/>
+                  <w:r>
+                    <w:rPr>
+                      <w:sz w:val="20"/>
+                      <w:lang w:val="en-US"/>
+                    </w:rPr>
+                    <w:t>number(</w:t>
+                  </w:r>
+                  <w:proofErr w:type="gramEnd"/>
+                  <w:r>
+                    <w:rPr>
+                      <w:sz w:val="20"/>
+                      <w:lang w:val="en-US"/>
+                    </w:rPr>
+                    <w:t>one separator type)</w:t>
                   </w:r>
                 </w:p>
               </w:tc>
@@ -2317,8 +2430,33 @@
                       <w:sz w:val="20"/>
                       <w:lang w:val="en-US"/>
                     </w:rPr>
-                    <w:t>- Comma for thousands separator</w:t>
-                  </w:r>
+                    <w:t xml:space="preserve">- Comma for </w:t>
+                  </w:r>
+                  <w:proofErr w:type="gramStart"/>
+                  <w:r>
+                    <w:rPr>
+                      <w:sz w:val="20"/>
+                      <w:lang w:val="en-US"/>
+                    </w:rPr>
+                    <w:t>thousands</w:t>
+                  </w:r>
+                  <w:proofErr w:type="gramEnd"/>
+                  <w:r>
+                    <w:rPr>
+                      <w:sz w:val="20"/>
+                      <w:lang w:val="en-US"/>
+                    </w:rPr>
+                    <w:t xml:space="preserve"> </w:t>
+                  </w:r>
+                  <w:proofErr w:type="gramStart"/>
+                  <w:r>
+                    <w:rPr>
+                      <w:sz w:val="20"/>
+                      <w:lang w:val="en-US"/>
+                    </w:rPr>
+                    <w:t>separator</w:t>
+                  </w:r>
+                  <w:proofErr w:type="gramEnd"/>
                 </w:p>
                 <w:p>
                   <w:pPr>
@@ -2575,8 +2713,33 @@
                       <w:sz w:val="20"/>
                       <w:lang w:val="en-US"/>
                     </w:rPr>
-                    <w:t>- Comma for thousands separator</w:t>
-                  </w:r>
+                    <w:t xml:space="preserve">- Comma for </w:t>
+                  </w:r>
+                  <w:proofErr w:type="gramStart"/>
+                  <w:r>
+                    <w:rPr>
+                      <w:sz w:val="20"/>
+                      <w:lang w:val="en-US"/>
+                    </w:rPr>
+                    <w:t>thousands</w:t>
+                  </w:r>
+                  <w:proofErr w:type="gramEnd"/>
+                  <w:r>
+                    <w:rPr>
+                      <w:sz w:val="20"/>
+                      <w:lang w:val="en-US"/>
+                    </w:rPr>
+                    <w:t xml:space="preserve"> </w:t>
+                  </w:r>
+                  <w:proofErr w:type="gramStart"/>
+                  <w:r>
+                    <w:rPr>
+                      <w:sz w:val="20"/>
+                      <w:lang w:val="en-US"/>
+                    </w:rPr>
+                    <w:t>separator</w:t>
+                  </w:r>
+                  <w:proofErr w:type="gramEnd"/>
                 </w:p>
                 <w:p>
                   <w:pPr>
@@ -2712,8 +2875,33 @@
                       <w:sz w:val="20"/>
                       <w:lang w:val="en-US"/>
                     </w:rPr>
-                    <w:t>- Comma for thousands separator</w:t>
-                  </w:r>
+                    <w:t xml:space="preserve">- Comma for </w:t>
+                  </w:r>
+                  <w:proofErr w:type="gramStart"/>
+                  <w:r>
+                    <w:rPr>
+                      <w:sz w:val="20"/>
+                      <w:lang w:val="en-US"/>
+                    </w:rPr>
+                    <w:t>thousands</w:t>
+                  </w:r>
+                  <w:proofErr w:type="gramEnd"/>
+                  <w:r>
+                    <w:rPr>
+                      <w:sz w:val="20"/>
+                      <w:lang w:val="en-US"/>
+                    </w:rPr>
+                    <w:t xml:space="preserve"> </w:t>
+                  </w:r>
+                  <w:proofErr w:type="gramStart"/>
+                  <w:r>
+                    <w:rPr>
+                      <w:sz w:val="20"/>
+                      <w:lang w:val="en-US"/>
+                    </w:rPr>
+                    <w:t>separator</w:t>
+                  </w:r>
+                  <w:proofErr w:type="gramEnd"/>
                 </w:p>
                 <w:p>
                   <w:pPr>
@@ -2848,8 +3036,33 @@
                       <w:sz w:val="20"/>
                       <w:lang w:val="en-US"/>
                     </w:rPr>
-                    <w:t>- Comma for thousands separator</w:t>
-                  </w:r>
+                    <w:t xml:space="preserve">- Comma for </w:t>
+                  </w:r>
+                  <w:proofErr w:type="gramStart"/>
+                  <w:r>
+                    <w:rPr>
+                      <w:sz w:val="20"/>
+                      <w:lang w:val="en-US"/>
+                    </w:rPr>
+                    <w:t>thousands</w:t>
+                  </w:r>
+                  <w:proofErr w:type="gramEnd"/>
+                  <w:r>
+                    <w:rPr>
+                      <w:sz w:val="20"/>
+                      <w:lang w:val="en-US"/>
+                    </w:rPr>
+                    <w:t xml:space="preserve"> </w:t>
+                  </w:r>
+                  <w:proofErr w:type="gramStart"/>
+                  <w:r>
+                    <w:rPr>
+                      <w:sz w:val="20"/>
+                      <w:lang w:val="en-US"/>
+                    </w:rPr>
+                    <w:t>separator</w:t>
+                  </w:r>
+                  <w:proofErr w:type="gramEnd"/>
                 </w:p>
                 <w:p>
                   <w:pPr>
@@ -2976,8 +3189,33 @@
                       <w:sz w:val="20"/>
                       <w:lang w:val="en-US"/>
                     </w:rPr>
-                    <w:t>- Comma for thousands separator</w:t>
-                  </w:r>
+                    <w:t xml:space="preserve">- Comma for </w:t>
+                  </w:r>
+                  <w:proofErr w:type="gramStart"/>
+                  <w:r>
+                    <w:rPr>
+                      <w:sz w:val="20"/>
+                      <w:lang w:val="en-US"/>
+                    </w:rPr>
+                    <w:t>thousands</w:t>
+                  </w:r>
+                  <w:proofErr w:type="gramEnd"/>
+                  <w:r>
+                    <w:rPr>
+                      <w:sz w:val="20"/>
+                      <w:lang w:val="en-US"/>
+                    </w:rPr>
+                    <w:t xml:space="preserve"> </w:t>
+                  </w:r>
+                  <w:proofErr w:type="gramStart"/>
+                  <w:r>
+                    <w:rPr>
+                      <w:sz w:val="20"/>
+                      <w:lang w:val="en-US"/>
+                    </w:rPr>
+                    <w:t>separator</w:t>
+                  </w:r>
+                  <w:proofErr w:type="gramEnd"/>
                 </w:p>
                 <w:p>
                   <w:pPr>
@@ -3085,12 +3323,21 @@
                       <w:lang w:val="en-US"/>
                     </w:rPr>
                   </w:pPr>
-                  <w:r>
-                    <w:rPr>
-                      <w:sz w:val="20"/>
-                      <w:lang w:val="en-US"/>
-                    </w:rPr>
-                    <w:t>Sum of subtotal and shipping fee</w:t>
+                  <w:proofErr w:type="gramStart"/>
+                  <w:r>
+                    <w:rPr>
+                      <w:sz w:val="20"/>
+                      <w:lang w:val="en-US"/>
+                    </w:rPr>
+                    <w:t>Sum</w:t>
+                  </w:r>
+                  <w:proofErr w:type="gramEnd"/>
+                  <w:r>
+                    <w:rPr>
+                      <w:sz w:val="20"/>
+                      <w:lang w:val="en-US"/>
+                    </w:rPr>
+                    <w:t xml:space="preserve"> of subtotal and shipping fee</w:t>
                   </w:r>
                 </w:p>
               </w:tc>
@@ -3834,7 +4081,23 @@
                       <w:sz w:val="20"/>
                       <w:lang w:val="en-US"/>
                     </w:rPr>
-                    <w:t>-Vienamese currency(VND)</w:t>
+                    <w:t xml:space="preserve">-Vienamese </w:t>
+                  </w:r>
+                  <w:proofErr w:type="gramStart"/>
+                  <w:r>
+                    <w:rPr>
+                      <w:sz w:val="20"/>
+                      <w:lang w:val="en-US"/>
+                    </w:rPr>
+                    <w:t>currency(</w:t>
+                  </w:r>
+                  <w:proofErr w:type="gramEnd"/>
+                  <w:r>
+                    <w:rPr>
+                      <w:sz w:val="20"/>
+                      <w:lang w:val="en-US"/>
+                    </w:rPr>
+                    <w:t>VND)</w:t>
                   </w:r>
                 </w:p>
                 <w:p>
@@ -4236,7 +4499,23 @@
                 <w:szCs w:val="24"/>
                 <w:lang w:val="en-US"/>
               </w:rPr>
-              <w:t>A new order is created, and its information is sent via email to the customer or nothing happens if payment is not successful</w:t>
+              <w:t xml:space="preserve">A new order is created, and its information is sent via email to the </w:t>
+            </w:r>
+            <w:proofErr w:type="gramStart"/>
+            <w:r>
+              <w:rPr>
+                <w:szCs w:val="24"/>
+                <w:lang w:val="en-US"/>
+              </w:rPr>
+              <w:t>customer</w:t>
+            </w:r>
+            <w:proofErr w:type="gramEnd"/>
+            <w:r>
+              <w:rPr>
+                <w:szCs w:val="24"/>
+                <w:lang w:val="en-US"/>
+              </w:rPr>
+              <w:t xml:space="preserve"> or nothing happens if payment is not successful</w:t>
             </w:r>
           </w:p>
         </w:tc>
@@ -5719,7 +5998,6 @@
   <w:style w:type="character" w:default="1" w:styleId="DefaultParagraphFont">
     <w:name w:val="Default Paragraph Font"/>
     <w:uiPriority w:val="1"/>
-    <w:semiHidden/>
     <w:unhideWhenUsed/>
   </w:style>
   <w:style w:type="table" w:default="1" w:styleId="TableNormal">

</xml_diff>

<commit_message>
fix: Update Place_order files word and PDF
</commit_message>
<xml_diff>
--- a/RequirementAnalysis/UCSpec/word/Place_Order.docx
+++ b/RequirementAnalysis/UCSpec/word/Place_Order.docx
@@ -1263,17 +1263,17 @@
               <w:tblLook w:val="04A0" w:firstRow="1" w:lastRow="0" w:firstColumn="1" w:lastColumn="0" w:noHBand="0" w:noVBand="1"/>
             </w:tblPr>
             <w:tblGrid>
-              <w:gridCol w:w="533"/>
-              <w:gridCol w:w="1345"/>
-              <w:gridCol w:w="1674"/>
-              <w:gridCol w:w="1183"/>
-              <w:gridCol w:w="1986"/>
-              <w:gridCol w:w="2364"/>
+              <w:gridCol w:w="530"/>
+              <w:gridCol w:w="1335"/>
+              <w:gridCol w:w="1705"/>
+              <w:gridCol w:w="1264"/>
+              <w:gridCol w:w="1945"/>
+              <w:gridCol w:w="2306"/>
             </w:tblGrid>
             <w:tr>
               <w:tc>
                 <w:tcPr>
-                  <w:tcW w:w="533" w:type="dxa"/>
+                  <w:tcW w:w="530" w:type="dxa"/>
                   <w:shd w:val="clear" w:color="auto" w:fill="8DD873" w:themeFill="accent6" w:themeFillTint="99"/>
                   <w:vAlign w:val="center"/>
                 </w:tcPr>
@@ -1297,7 +1297,7 @@
               </w:tc>
               <w:tc>
                 <w:tcPr>
-                  <w:tcW w:w="1345" w:type="dxa"/>
+                  <w:tcW w:w="1335" w:type="dxa"/>
                   <w:shd w:val="clear" w:color="auto" w:fill="8DD873" w:themeFill="accent6" w:themeFillTint="99"/>
                   <w:vAlign w:val="center"/>
                 </w:tcPr>
@@ -1321,7 +1321,7 @@
               </w:tc>
               <w:tc>
                 <w:tcPr>
-                  <w:tcW w:w="1674" w:type="dxa"/>
+                  <w:tcW w:w="1705" w:type="dxa"/>
                   <w:shd w:val="clear" w:color="auto" w:fill="8DD873" w:themeFill="accent6" w:themeFillTint="99"/>
                   <w:vAlign w:val="center"/>
                 </w:tcPr>
@@ -1345,7 +1345,7 @@
               </w:tc>
               <w:tc>
                 <w:tcPr>
-                  <w:tcW w:w="1183" w:type="dxa"/>
+                  <w:tcW w:w="1264" w:type="dxa"/>
                   <w:shd w:val="clear" w:color="auto" w:fill="8DD873" w:themeFill="accent6" w:themeFillTint="99"/>
                   <w:vAlign w:val="center"/>
                 </w:tcPr>
@@ -1369,7 +1369,7 @@
               </w:tc>
               <w:tc>
                 <w:tcPr>
-                  <w:tcW w:w="1986" w:type="dxa"/>
+                  <w:tcW w:w="1945" w:type="dxa"/>
                   <w:shd w:val="clear" w:color="auto" w:fill="8DD873" w:themeFill="accent6" w:themeFillTint="99"/>
                   <w:vAlign w:val="center"/>
                 </w:tcPr>
@@ -1393,7 +1393,7 @@
               </w:tc>
               <w:tc>
                 <w:tcPr>
-                  <w:tcW w:w="2364" w:type="dxa"/>
+                  <w:tcW w:w="2306" w:type="dxa"/>
                   <w:shd w:val="clear" w:color="auto" w:fill="8DD873" w:themeFill="accent6" w:themeFillTint="99"/>
                   <w:vAlign w:val="center"/>
                 </w:tcPr>
@@ -1419,7 +1419,7 @@
             <w:tr>
               <w:tc>
                 <w:tcPr>
-                  <w:tcW w:w="533" w:type="dxa"/>
+                  <w:tcW w:w="530" w:type="dxa"/>
                   <w:vAlign w:val="center"/>
                 </w:tcPr>
                 <w:p>
@@ -1437,7 +1437,7 @@
               </w:tc>
               <w:tc>
                 <w:tcPr>
-                  <w:tcW w:w="1345" w:type="dxa"/>
+                  <w:tcW w:w="1335" w:type="dxa"/>
                   <w:vAlign w:val="center"/>
                 </w:tcPr>
                 <w:p>
@@ -1458,20 +1458,27 @@
               </w:tc>
               <w:tc>
                 <w:tcPr>
-                  <w:tcW w:w="1674" w:type="dxa"/>
-                  <w:vAlign w:val="center"/>
-                </w:tcPr>
-                <w:p>
-                  <w:pPr>
-                    <w:rPr>
-                      <w:sz w:val="20"/>
-                    </w:rPr>
-                  </w:pPr>
-                </w:p>
-              </w:tc>
-              <w:tc>
-                <w:tcPr>
-                  <w:tcW w:w="1183" w:type="dxa"/>
+                  <w:tcW w:w="1705" w:type="dxa"/>
+                  <w:vAlign w:val="center"/>
+                </w:tcPr>
+                <w:p>
+                  <w:pPr>
+                    <w:rPr>
+                      <w:sz w:val="20"/>
+                    </w:rPr>
+                  </w:pPr>
+                  <w:r>
+                    <w:rPr>
+                      <w:sz w:val="20"/>
+                      <w:lang w:val="en-US"/>
+                    </w:rPr>
+                    <w:t>Name of the recipient, used for delivery</w:t>
+                  </w:r>
+                </w:p>
+              </w:tc>
+              <w:tc>
+                <w:tcPr>
+                  <w:tcW w:w="1264" w:type="dxa"/>
                   <w:vAlign w:val="center"/>
                 </w:tcPr>
                 <w:p>
@@ -1492,20 +1499,27 @@
               </w:tc>
               <w:tc>
                 <w:tcPr>
-                  <w:tcW w:w="1986" w:type="dxa"/>
-                  <w:vAlign w:val="center"/>
-                </w:tcPr>
-                <w:p>
-                  <w:pPr>
-                    <w:rPr>
-                      <w:sz w:val="20"/>
-                    </w:rPr>
-                  </w:pPr>
-                </w:p>
-              </w:tc>
-              <w:tc>
-                <w:tcPr>
-                  <w:tcW w:w="2364" w:type="dxa"/>
+                  <w:tcW w:w="1945" w:type="dxa"/>
+                  <w:vAlign w:val="center"/>
+                </w:tcPr>
+                <w:p>
+                  <w:pPr>
+                    <w:rPr>
+                      <w:sz w:val="20"/>
+                    </w:rPr>
+                  </w:pPr>
+                  <w:r>
+                    <w:rPr>
+                      <w:sz w:val="20"/>
+                      <w:lang w:val="en-US"/>
+                    </w:rPr>
+                    <w:t>Must contain only letters, not empty</w:t>
+                  </w:r>
+                </w:p>
+              </w:tc>
+              <w:tc>
+                <w:tcPr>
+                  <w:tcW w:w="2306" w:type="dxa"/>
                   <w:vAlign w:val="center"/>
                 </w:tcPr>
                 <w:p>
@@ -1528,7 +1542,7 @@
             <w:tr>
               <w:tc>
                 <w:tcPr>
-                  <w:tcW w:w="533" w:type="dxa"/>
+                  <w:tcW w:w="530" w:type="dxa"/>
                   <w:vAlign w:val="center"/>
                 </w:tcPr>
                 <w:p>
@@ -1546,7 +1560,7 @@
               </w:tc>
               <w:tc>
                 <w:tcPr>
-                  <w:tcW w:w="1345" w:type="dxa"/>
+                  <w:tcW w:w="1335" w:type="dxa"/>
                   <w:vAlign w:val="center"/>
                 </w:tcPr>
                 <w:p>
@@ -1567,20 +1581,27 @@
               </w:tc>
               <w:tc>
                 <w:tcPr>
-                  <w:tcW w:w="1674" w:type="dxa"/>
-                  <w:vAlign w:val="center"/>
-                </w:tcPr>
-                <w:p>
-                  <w:pPr>
-                    <w:rPr>
-                      <w:sz w:val="20"/>
-                    </w:rPr>
-                  </w:pPr>
-                </w:p>
-              </w:tc>
-              <w:tc>
-                <w:tcPr>
-                  <w:tcW w:w="1183" w:type="dxa"/>
+                  <w:tcW w:w="1705" w:type="dxa"/>
+                  <w:vAlign w:val="center"/>
+                </w:tcPr>
+                <w:p>
+                  <w:pPr>
+                    <w:rPr>
+                      <w:sz w:val="20"/>
+                    </w:rPr>
+                  </w:pPr>
+                  <w:r>
+                    <w:rPr>
+                      <w:sz w:val="20"/>
+                      <w:lang w:val="en-US"/>
+                    </w:rPr>
+                    <w:t>Recipient's phone number</w:t>
+                  </w:r>
+                </w:p>
+              </w:tc>
+              <w:tc>
+                <w:tcPr>
+                  <w:tcW w:w="1264" w:type="dxa"/>
                   <w:vAlign w:val="center"/>
                 </w:tcPr>
                 <w:p>
@@ -1601,7 +1622,7 @@
               </w:tc>
               <w:tc>
                 <w:tcPr>
-                  <w:tcW w:w="1986" w:type="dxa"/>
+                  <w:tcW w:w="1945" w:type="dxa"/>
                   <w:vAlign w:val="center"/>
                 </w:tcPr>
                 <w:p>
@@ -1655,7 +1676,7 @@
               </w:tc>
               <w:tc>
                 <w:tcPr>
-                  <w:tcW w:w="2364" w:type="dxa"/>
+                  <w:tcW w:w="2306" w:type="dxa"/>
                   <w:vAlign w:val="center"/>
                 </w:tcPr>
                 <w:p>
@@ -1723,7 +1744,7 @@
             <w:tr>
               <w:tc>
                 <w:tcPr>
-                  <w:tcW w:w="533" w:type="dxa"/>
+                  <w:tcW w:w="530" w:type="dxa"/>
                   <w:vAlign w:val="center"/>
                 </w:tcPr>
                 <w:p>
@@ -1741,7 +1762,7 @@
               </w:tc>
               <w:tc>
                 <w:tcPr>
-                  <w:tcW w:w="1345" w:type="dxa"/>
+                  <w:tcW w:w="1335" w:type="dxa"/>
                   <w:vAlign w:val="center"/>
                 </w:tcPr>
                 <w:p>
@@ -1762,28 +1783,28 @@
               </w:tc>
               <w:tc>
                 <w:tcPr>
-                  <w:tcW w:w="1674" w:type="dxa"/>
-                  <w:vAlign w:val="center"/>
-                </w:tcPr>
-                <w:p>
-                  <w:pPr>
-                    <w:rPr>
-                      <w:sz w:val="20"/>
-                      <w:lang w:val="en-US"/>
-                    </w:rPr>
-                  </w:pPr>
-                  <w:r>
-                    <w:rPr>
-                      <w:sz w:val="20"/>
-                      <w:lang w:val="en-US"/>
-                    </w:rPr>
-                    <w:t>Choose from a list</w:t>
-                  </w:r>
-                </w:p>
-              </w:tc>
-              <w:tc>
-                <w:tcPr>
-                  <w:tcW w:w="1183" w:type="dxa"/>
+                  <w:tcW w:w="1705" w:type="dxa"/>
+                  <w:vAlign w:val="center"/>
+                </w:tcPr>
+                <w:p>
+                  <w:pPr>
+                    <w:rPr>
+                      <w:sz w:val="20"/>
+                      <w:lang w:val="en-US"/>
+                    </w:rPr>
+                  </w:pPr>
+                  <w:r>
+                    <w:rPr>
+                      <w:sz w:val="20"/>
+                      <w:lang w:val="en-US"/>
+                    </w:rPr>
+                    <w:t>Province or city of the recipient</w:t>
+                  </w:r>
+                </w:p>
+              </w:tc>
+              <w:tc>
+                <w:tcPr>
+                  <w:tcW w:w="1264" w:type="dxa"/>
                   <w:vAlign w:val="center"/>
                 </w:tcPr>
                 <w:p>
@@ -1804,20 +1825,27 @@
               </w:tc>
               <w:tc>
                 <w:tcPr>
-                  <w:tcW w:w="1986" w:type="dxa"/>
-                  <w:vAlign w:val="center"/>
-                </w:tcPr>
-                <w:p>
-                  <w:pPr>
-                    <w:rPr>
-                      <w:sz w:val="20"/>
-                    </w:rPr>
-                  </w:pPr>
-                </w:p>
-              </w:tc>
-              <w:tc>
-                <w:tcPr>
-                  <w:tcW w:w="2364" w:type="dxa"/>
+                  <w:tcW w:w="1945" w:type="dxa"/>
+                  <w:vAlign w:val="center"/>
+                </w:tcPr>
+                <w:p>
+                  <w:pPr>
+                    <w:rPr>
+                      <w:sz w:val="20"/>
+                    </w:rPr>
+                  </w:pPr>
+                  <w:r>
+                    <w:rPr>
+                      <w:sz w:val="20"/>
+                      <w:lang w:val="en-US"/>
+                    </w:rPr>
+                    <w:t>Must be selected from the provided list</w:t>
+                  </w:r>
+                </w:p>
+              </w:tc>
+              <w:tc>
+                <w:tcPr>
+                  <w:tcW w:w="2306" w:type="dxa"/>
                   <w:vAlign w:val="center"/>
                 </w:tcPr>
                 <w:p>
@@ -1840,7 +1868,7 @@
             <w:tr>
               <w:tc>
                 <w:tcPr>
-                  <w:tcW w:w="533" w:type="dxa"/>
+                  <w:tcW w:w="530" w:type="dxa"/>
                   <w:vAlign w:val="center"/>
                 </w:tcPr>
                 <w:p>
@@ -1858,7 +1886,7 @@
               </w:tc>
               <w:tc>
                 <w:tcPr>
-                  <w:tcW w:w="1345" w:type="dxa"/>
+                  <w:tcW w:w="1335" w:type="dxa"/>
                   <w:vAlign w:val="center"/>
                 </w:tcPr>
                 <w:p>
@@ -1879,20 +1907,27 @@
               </w:tc>
               <w:tc>
                 <w:tcPr>
-                  <w:tcW w:w="1674" w:type="dxa"/>
-                  <w:vAlign w:val="center"/>
-                </w:tcPr>
-                <w:p>
-                  <w:pPr>
-                    <w:rPr>
-                      <w:sz w:val="20"/>
-                    </w:rPr>
-                  </w:pPr>
-                </w:p>
-              </w:tc>
-              <w:tc>
-                <w:tcPr>
-                  <w:tcW w:w="1183" w:type="dxa"/>
+                  <w:tcW w:w="1705" w:type="dxa"/>
+                  <w:vAlign w:val="center"/>
+                </w:tcPr>
+                <w:p>
+                  <w:pPr>
+                    <w:rPr>
+                      <w:sz w:val="20"/>
+                    </w:rPr>
+                  </w:pPr>
+                  <w:r>
+                    <w:rPr>
+                      <w:sz w:val="20"/>
+                      <w:lang w:val="en-US"/>
+                    </w:rPr>
+                    <w:t>Detailed street address of the recipient</w:t>
+                  </w:r>
+                </w:p>
+              </w:tc>
+              <w:tc>
+                <w:tcPr>
+                  <w:tcW w:w="1264" w:type="dxa"/>
                   <w:vAlign w:val="center"/>
                 </w:tcPr>
                 <w:p>
@@ -1913,20 +1948,27 @@
               </w:tc>
               <w:tc>
                 <w:tcPr>
-                  <w:tcW w:w="1986" w:type="dxa"/>
-                  <w:vAlign w:val="center"/>
-                </w:tcPr>
-                <w:p>
-                  <w:pPr>
-                    <w:rPr>
-                      <w:sz w:val="20"/>
-                    </w:rPr>
-                  </w:pPr>
-                </w:p>
-              </w:tc>
-              <w:tc>
-                <w:tcPr>
-                  <w:tcW w:w="2364" w:type="dxa"/>
+                  <w:tcW w:w="1945" w:type="dxa"/>
+                  <w:vAlign w:val="center"/>
+                </w:tcPr>
+                <w:p>
+                  <w:pPr>
+                    <w:rPr>
+                      <w:sz w:val="20"/>
+                    </w:rPr>
+                  </w:pPr>
+                  <w:r>
+                    <w:rPr>
+                      <w:sz w:val="20"/>
+                      <w:lang w:val="en-US"/>
+                    </w:rPr>
+                    <w:t>Cannot be empty</w:t>
+                  </w:r>
+                </w:p>
+              </w:tc>
+              <w:tc>
+                <w:tcPr>
+                  <w:tcW w:w="2306" w:type="dxa"/>
                   <w:vAlign w:val="center"/>
                 </w:tcPr>
                 <w:p>
@@ -1949,7 +1991,7 @@
             <w:tr>
               <w:tc>
                 <w:tcPr>
-                  <w:tcW w:w="533" w:type="dxa"/>
+                  <w:tcW w:w="530" w:type="dxa"/>
                   <w:vAlign w:val="center"/>
                 </w:tcPr>
                 <w:p>
@@ -1967,7 +2009,7 @@
               </w:tc>
               <w:tc>
                 <w:tcPr>
-                  <w:tcW w:w="1345" w:type="dxa"/>
+                  <w:tcW w:w="1335" w:type="dxa"/>
                   <w:vAlign w:val="center"/>
                 </w:tcPr>
                 <w:p>
@@ -1988,20 +2030,27 @@
               </w:tc>
               <w:tc>
                 <w:tcPr>
-                  <w:tcW w:w="1674" w:type="dxa"/>
-                  <w:vAlign w:val="center"/>
-                </w:tcPr>
-                <w:p>
-                  <w:pPr>
-                    <w:rPr>
-                      <w:sz w:val="20"/>
-                    </w:rPr>
-                  </w:pPr>
-                </w:p>
-              </w:tc>
-              <w:tc>
-                <w:tcPr>
-                  <w:tcW w:w="1183" w:type="dxa"/>
+                  <w:tcW w:w="1705" w:type="dxa"/>
+                  <w:vAlign w:val="center"/>
+                </w:tcPr>
+                <w:p>
+                  <w:pPr>
+                    <w:rPr>
+                      <w:sz w:val="20"/>
+                    </w:rPr>
+                  </w:pPr>
+                  <w:r>
+                    <w:rPr>
+                      <w:sz w:val="20"/>
+                      <w:lang w:val="en-US"/>
+                    </w:rPr>
+                    <w:t>Additional instructions for delivery (optional)</w:t>
+                  </w:r>
+                </w:p>
+              </w:tc>
+              <w:tc>
+                <w:tcPr>
+                  <w:tcW w:w="1264" w:type="dxa"/>
                   <w:vAlign w:val="center"/>
                 </w:tcPr>
                 <w:p>
@@ -2022,28 +2071,43 @@
               </w:tc>
               <w:tc>
                 <w:tcPr>
-                  <w:tcW w:w="1986" w:type="dxa"/>
-                  <w:vAlign w:val="center"/>
-                </w:tcPr>
-                <w:p>
-                  <w:pPr>
-                    <w:rPr>
-                      <w:sz w:val="20"/>
-                    </w:rPr>
-                  </w:pPr>
-                </w:p>
-              </w:tc>
-              <w:tc>
-                <w:tcPr>
-                  <w:tcW w:w="2364" w:type="dxa"/>
-                  <w:vAlign w:val="center"/>
-                </w:tcPr>
-                <w:p>
-                  <w:pPr>
-                    <w:rPr>
-                      <w:sz w:val="20"/>
-                    </w:rPr>
-                  </w:pPr>
+                  <w:tcW w:w="1945" w:type="dxa"/>
+                  <w:vAlign w:val="center"/>
+                </w:tcPr>
+                <w:p>
+                  <w:pPr>
+                    <w:rPr>
+                      <w:sz w:val="20"/>
+                    </w:rPr>
+                  </w:pPr>
+                  <w:r>
+                    <w:rPr>
+                      <w:sz w:val="20"/>
+                      <w:lang w:val="en-US"/>
+                    </w:rPr>
+                    <w:t>Can be left empty; text up to 200 characters</w:t>
+                  </w:r>
+                </w:p>
+              </w:tc>
+              <w:tc>
+                <w:tcPr>
+                  <w:tcW w:w="2306" w:type="dxa"/>
+                  <w:vAlign w:val="center"/>
+                </w:tcPr>
+                <w:p>
+                  <w:pPr>
+                    <w:rPr>
+                      <w:sz w:val="20"/>
+                      <w:lang w:val="en-US"/>
+                    </w:rPr>
+                  </w:pPr>
+                  <w:r>
+                    <w:rPr>
+                      <w:sz w:val="20"/>
+                      <w:lang w:val="en-US"/>
+                    </w:rPr>
+                    <w:t>Ship dirrectly to the house</w:t>
+                  </w:r>
                 </w:p>
               </w:tc>
             </w:tr>
@@ -2325,6 +2389,13 @@
                       <w:sz w:val="20"/>
                     </w:rPr>
                   </w:pPr>
+                  <w:r>
+                    <w:rPr>
+                      <w:sz w:val="20"/>
+                      <w:lang w:val="en-US"/>
+                    </w:rPr>
+                    <w:t>Text, letters, and numbers</w:t>
+                  </w:r>
                 </w:p>
               </w:tc>
               <w:tc>
@@ -3169,6 +3240,13 @@
                       <w:sz w:val="20"/>
                     </w:rPr>
                   </w:pPr>
+                  <w:r>
+                    <w:rPr>
+                      <w:sz w:val="20"/>
+                      <w:lang w:val="en-US"/>
+                    </w:rPr>
+                    <w:t> Fee for delivering the order</w:t>
+                  </w:r>
                 </w:p>
               </w:tc>
               <w:tc>
@@ -3348,10 +3426,76 @@
                 </w:tcPr>
                 <w:p>
                   <w:pPr>
-                    <w:rPr>
-                      <w:sz w:val="20"/>
-                    </w:rPr>
-                  </w:pPr>
+                    <w:jc w:val="left"/>
+                    <w:rPr>
+                      <w:sz w:val="20"/>
+                      <w:lang w:val="en-US"/>
+                    </w:rPr>
+                  </w:pPr>
+                  <w:r>
+                    <w:rPr>
+                      <w:sz w:val="20"/>
+                      <w:lang w:val="en-US"/>
+                    </w:rPr>
+                    <w:t xml:space="preserve">- Comma for </w:t>
+                  </w:r>
+                  <w:proofErr w:type="gramStart"/>
+                  <w:r>
+                    <w:rPr>
+                      <w:sz w:val="20"/>
+                      <w:lang w:val="en-US"/>
+                    </w:rPr>
+                    <w:t>thousands</w:t>
+                  </w:r>
+                  <w:proofErr w:type="gramEnd"/>
+                  <w:r>
+                    <w:rPr>
+                      <w:sz w:val="20"/>
+                      <w:lang w:val="en-US"/>
+                    </w:rPr>
+                    <w:t xml:space="preserve"> </w:t>
+                  </w:r>
+                  <w:proofErr w:type="gramStart"/>
+                  <w:r>
+                    <w:rPr>
+                      <w:sz w:val="20"/>
+                      <w:lang w:val="en-US"/>
+                    </w:rPr>
+                    <w:t>separator</w:t>
+                  </w:r>
+                  <w:proofErr w:type="gramEnd"/>
+                </w:p>
+                <w:p>
+                  <w:pPr>
+                    <w:jc w:val="left"/>
+                    <w:rPr>
+                      <w:sz w:val="20"/>
+                      <w:lang w:val="en-US"/>
+                    </w:rPr>
+                  </w:pPr>
+                  <w:r>
+                    <w:rPr>
+                      <w:sz w:val="20"/>
+                      <w:lang w:val="en-US"/>
+                    </w:rPr>
+                    <w:t>- Positive integer</w:t>
+                  </w:r>
+                </w:p>
+                <w:p>
+                  <w:pPr>
+                    <w:jc w:val="left"/>
+                    <w:rPr>
+                      <w:sz w:val="20"/>
+                      <w:lang w:val="en-US"/>
+                    </w:rPr>
+                  </w:pPr>
+                  <w:r>
+                    <w:rPr>
+                      <w:sz w:val="20"/>
+                      <w:lang w:val="en-US"/>
+                    </w:rPr>
+                    <w:t>- Right alignment</w:t>
+                  </w:r>
                 </w:p>
               </w:tc>
               <w:tc>
@@ -3616,6 +3760,13 @@
                       <w:sz w:val="20"/>
                     </w:rPr>
                   </w:pPr>
+                  <w:r>
+                    <w:rPr>
+                      <w:sz w:val="20"/>
+                      <w:lang w:val="en-US"/>
+                    </w:rPr>
+                    <w:t>Name of the customer</w:t>
+                  </w:r>
                 </w:p>
               </w:tc>
               <w:tc>
@@ -3632,6 +3783,13 @@
                       <w:sz w:val="20"/>
                     </w:rPr>
                   </w:pPr>
+                  <w:r>
+                    <w:rPr>
+                      <w:sz w:val="20"/>
+                      <w:lang w:val="en-US"/>
+                    </w:rPr>
+                    <w:t>Text, letters only, cannot be empty</w:t>
+                  </w:r>
                 </w:p>
               </w:tc>
               <w:tc>
@@ -3721,6 +3879,13 @@
                       <w:sz w:val="20"/>
                     </w:rPr>
                   </w:pPr>
+                  <w:r>
+                    <w:rPr>
+                      <w:sz w:val="20"/>
+                      <w:lang w:val="en-US"/>
+                    </w:rPr>
+                    <w:t>Customer’s phone number</w:t>
+                  </w:r>
                 </w:p>
               </w:tc>
               <w:tc>
@@ -3737,6 +3902,13 @@
                       <w:sz w:val="20"/>
                     </w:rPr>
                   </w:pPr>
+                  <w:r>
+                    <w:rPr>
+                      <w:sz w:val="20"/>
+                      <w:lang w:val="en-US"/>
+                    </w:rPr>
+                    <w:t>10 digits, may include spaces or dashes (“-”), one type only</w:t>
+                  </w:r>
                 </w:p>
               </w:tc>
               <w:tc>
@@ -3833,6 +4005,13 @@
                       <w:sz w:val="20"/>
                     </w:rPr>
                   </w:pPr>
+                  <w:r>
+                    <w:rPr>
+                      <w:sz w:val="20"/>
+                      <w:lang w:val="en-US"/>
+                    </w:rPr>
+                    <w:t> Province or city of the customer</w:t>
+                  </w:r>
                 </w:p>
               </w:tc>
               <w:tc>
@@ -3849,6 +4028,13 @@
                       <w:sz w:val="20"/>
                     </w:rPr>
                   </w:pPr>
+                  <w:r>
+                    <w:rPr>
+                      <w:sz w:val="20"/>
+                      <w:lang w:val="en-US"/>
+                    </w:rPr>
+                    <w:t>Selected from a predefined list</w:t>
+                  </w:r>
                 </w:p>
               </w:tc>
               <w:tc>
@@ -3938,6 +4124,13 @@
                       <w:sz w:val="20"/>
                     </w:rPr>
                   </w:pPr>
+                  <w:r>
+                    <w:rPr>
+                      <w:sz w:val="20"/>
+                      <w:lang w:val="en-US"/>
+                    </w:rPr>
+                    <w:t>Detailed street address of the customer</w:t>
+                  </w:r>
                 </w:p>
               </w:tc>
               <w:tc>
@@ -3954,6 +4147,13 @@
                       <w:sz w:val="20"/>
                     </w:rPr>
                   </w:pPr>
+                  <w:r>
+                    <w:rPr>
+                      <w:sz w:val="20"/>
+                      <w:lang w:val="en-US"/>
+                    </w:rPr>
+                    <w:t>Text, cannot be empty</w:t>
+                  </w:r>
                 </w:p>
               </w:tc>
               <w:tc>
@@ -4040,6 +4240,23 @@
                     <w:ind w:left="4"/>
                     <w:rPr>
                       <w:sz w:val="20"/>
+                      <w:lang w:val="en-US"/>
+                    </w:rPr>
+                  </w:pPr>
+                  <w:r>
+                    <w:rPr>
+                      <w:sz w:val="20"/>
+                      <w:lang w:val="en-US"/>
+                    </w:rPr>
+                    <w:t>Total payment amount</w:t>
+                  </w:r>
+                </w:p>
+                <w:p>
+                  <w:pPr>
+                    <w:widowControl w:val="0"/>
+                    <w:rPr>
+                      <w:sz w:val="20"/>
+                      <w:lang w:val="en-US"/>
                     </w:rPr>
                   </w:pPr>
                 </w:p>
@@ -4163,6 +4380,7 @@
                       <w:sz w:val="20"/>
                       <w:lang w:val="en-US"/>
                     </w:rPr>
+                    <w:lastRenderedPageBreak/>
                     <w:t>6.</w:t>
                   </w:r>
                 </w:p>
@@ -4205,6 +4423,13 @@
                       <w:sz w:val="20"/>
                     </w:rPr>
                   </w:pPr>
+                  <w:r>
+                    <w:rPr>
+                      <w:sz w:val="20"/>
+                      <w:lang w:val="en-US"/>
+                    </w:rPr>
+                    <w:t>Unique identifier of the transaction</w:t>
+                  </w:r>
                 </w:p>
               </w:tc>
               <w:tc>
@@ -4221,6 +4446,13 @@
                       <w:sz w:val="20"/>
                     </w:rPr>
                   </w:pPr>
+                  <w:r>
+                    <w:rPr>
+                      <w:sz w:val="20"/>
+                      <w:lang w:val="en-US"/>
+                    </w:rPr>
+                    <w:t>Number</w:t>
+                  </w:r>
                 </w:p>
               </w:tc>
               <w:tc>
@@ -4237,6 +4469,13 @@
                       <w:sz w:val="20"/>
                     </w:rPr>
                   </w:pPr>
+                  <w:r>
+                    <w:rPr>
+                      <w:sz w:val="20"/>
+                      <w:lang w:val="en-US"/>
+                    </w:rPr>
+                    <w:t>123123123</w:t>
+                  </w:r>
                 </w:p>
               </w:tc>
             </w:tr>
@@ -4302,6 +4541,13 @@
                       <w:sz w:val="20"/>
                     </w:rPr>
                   </w:pPr>
+                  <w:r>
+                    <w:rPr>
+                      <w:sz w:val="20"/>
+                      <w:lang w:val="en-US"/>
+                    </w:rPr>
+                    <w:t> Description of the transaction</w:t>
+                  </w:r>
                 </w:p>
               </w:tc>
               <w:tc>
@@ -4318,6 +4564,13 @@
                       <w:sz w:val="20"/>
                     </w:rPr>
                   </w:pPr>
+                  <w:r>
+                    <w:rPr>
+                      <w:sz w:val="20"/>
+                      <w:lang w:val="en-US"/>
+                    </w:rPr>
+                    <w:t>Text</w:t>
+                  </w:r>
                 </w:p>
               </w:tc>
               <w:tc>
@@ -4334,6 +4587,13 @@
                       <w:sz w:val="20"/>
                     </w:rPr>
                   </w:pPr>
+                  <w:r>
+                    <w:rPr>
+                      <w:sz w:val="20"/>
+                      <w:lang w:val="en-US"/>
+                    </w:rPr>
+                    <w:t>Purchase of Media Product</w:t>
+                  </w:r>
                 </w:p>
               </w:tc>
             </w:tr>
@@ -4381,15 +4641,7 @@
                       <w:sz w:val="20"/>
                       <w:lang w:val="en-US"/>
                     </w:rPr>
-                    <w:t xml:space="preserve">Transaction </w:t>
-                  </w:r>
-                  <w:r>
-                    <w:rPr>
-                      <w:sz w:val="20"/>
-                      <w:lang w:val="en-US"/>
-                    </w:rPr>
-                    <w:lastRenderedPageBreak/>
-                    <w:t>date</w:t>
+                    <w:t>Transaction date</w:t>
                   </w:r>
                 </w:p>
               </w:tc>
@@ -4407,6 +4659,13 @@
                       <w:sz w:val="20"/>
                     </w:rPr>
                   </w:pPr>
+                  <w:r>
+                    <w:rPr>
+                      <w:sz w:val="20"/>
+                      <w:lang w:val="en-US"/>
+                    </w:rPr>
+                    <w:t>Date of the transaction</w:t>
+                  </w:r>
                 </w:p>
               </w:tc>
               <w:tc>

</xml_diff>